<commit_message>
fix: correct Jinja tag syntax in template.docx to use {%p instead of {% p to prevent docxtpl TemplateSyntaxError
</commit_message>
<xml_diff>
--- a/workspaces/auto-resume-tailoring-assistant/template.docx
+++ b/workspaces/auto-resume-tailoring-assistant/template.docx
@@ -721,7 +721,7 @@
     </w:p>
     <w:p>
       <w:r>
-        <w:t>{% p for proj in projects %}</w:t>
+        <w:t>{%p for proj in projects %}</w:t>
       </w:r>
     </w:p>
     <w:p>
@@ -747,7 +747,7 @@
     </w:p>
     <w:p>
       <w:r>
-        <w:t>{% p for bullet in proj.bullets %}</w:t>
+        <w:t>{%p for bullet in proj.bullets %}</w:t>
       </w:r>
     </w:p>
     <w:p>
@@ -769,12 +769,12 @@
     </w:p>
     <w:p>
       <w:r>
-        <w:t>{% p endfor %}</w:t>
-      </w:r>
-    </w:p>
-    <w:p>
-      <w:r>
-        <w:t>{% p endfor %}</w:t>
+        <w:t>{%p endfor %}</w:t>
+      </w:r>
+    </w:p>
+    <w:p>
+      <w:r>
+        <w:t>{%p endfor %}</w:t>
       </w:r>
     </w:p>
     <w:p>

</xml_diff>

<commit_message>
fix: replace docxtpl paragraph tags {%p with standard Jinja tags {% to bypass docxtpl parser issues
</commit_message>
<xml_diff>
--- a/workspaces/auto-resume-tailoring-assistant/template.docx
+++ b/workspaces/auto-resume-tailoring-assistant/template.docx
@@ -721,7 +721,7 @@
     </w:p>
     <w:p>
       <w:r>
-        <w:t>{%p for proj in projects %}</w:t>
+        <w:t>{% for proj in projects %}</w:t>
       </w:r>
     </w:p>
     <w:p>
@@ -747,7 +747,7 @@
     </w:p>
     <w:p>
       <w:r>
-        <w:t>{%p for bullet in proj.bullets %}</w:t>
+        <w:t>{% for bullet in proj.bullets %}</w:t>
       </w:r>
     </w:p>
     <w:p>
@@ -769,12 +769,12 @@
     </w:p>
     <w:p>
       <w:r>
-        <w:t>{%p endfor %}</w:t>
-      </w:r>
-    </w:p>
-    <w:p>
-      <w:r>
-        <w:t>{%p endfor %}</w:t>
+        <w:t>{% endfor %}</w:t>
+      </w:r>
+    </w:p>
+    <w:p>
+      <w:r>
+        <w:t>{% endfor %}</w:t>
       </w:r>
     </w:p>
     <w:p>

</xml_diff>